<commit_message>
Add ASCII wireframes for user stories, SRS section 1 draft, and updated datasets
Co-Authored-By: Claude Opus 4.6 (1M context) <noreply@anthropic.com>
</commit_message>
<xml_diff>
--- a/m0.docx
+++ b/m0.docx
@@ -797,13 +797,13 @@
       </w:r>
     </w:p>
     <w:bookmarkEnd w:id="26"/>
-    <w:bookmarkStart w:id="27" w:name="Xb630d4a93fec45e77c743efa7418f67b4db33a6"/>
+    <w:bookmarkStart w:id="27" w:name="section-4--user-scenarios-and-wireflows"/>
     <w:p>
       <w:pPr>
         <w:pStyle w:val="Heading3"/>
       </w:pPr>
       <w:r>
-        <w:t xml:space="preserve">Section 4 — User Scenarios and Storyboards</w:t>
+        <w:t xml:space="preserve">Section 4 — User Scenarios and Wireflows</w:t>
       </w:r>
     </w:p>
     <w:p>
@@ -811,7 +811,82 @@
         <w:pStyle w:val="FirstParagraph"/>
       </w:pPr>
       <w:r>
-        <w:t xml:space="preserve">For each major feature:</w:t>
+        <w:t xml:space="preserve">For each user story, write a</w:t>
+      </w:r>
+      <w:r>
+        <w:t xml:space="preserve"> </w:t>
+      </w:r>
+      <w:r>
+        <w:rPr>
+          <w:b/>
+          <w:bCs/>
+        </w:rPr>
+        <w:t xml:space="preserve">Gherkin scenario</w:t>
+      </w:r>
+      <w:r>
+        <w:t xml:space="preserve"> </w:t>
+      </w:r>
+      <w:r>
+        <w:t xml:space="preserve">describing the happy path interaction and include a</w:t>
+      </w:r>
+      <w:r>
+        <w:t xml:space="preserve"> </w:t>
+      </w:r>
+      <w:r>
+        <w:rPr>
+          <w:b/>
+          <w:bCs/>
+        </w:rPr>
+        <w:t xml:space="preserve">wireflow</w:t>
+      </w:r>
+      <w:r>
+        <w:t xml:space="preserve"> </w:t>
+      </w:r>
+      <w:r>
+        <w:t xml:space="preserve">illustrating that flow. You may also write additional Gherkin scenarios for sad paths and edge cases (e.g., invalid input, unauthorized access, empty states), but these do not require a wireflow.</w:t>
+      </w:r>
+    </w:p>
+    <w:p>
+      <w:pPr>
+        <w:pStyle w:val="BodyText"/>
+      </w:pPr>
+      <w:r>
+        <w:rPr>
+          <w:b/>
+          <w:bCs/>
+        </w:rPr>
+        <w:t xml:space="preserve">Justification:</w:t>
+      </w:r>
+      <w:r>
+        <w:t xml:space="preserve"> </w:t>
+      </w:r>
+      <w:r>
+        <w:t xml:space="preserve">Write one paragraph explaining how your design promotes usability. Give concrete examples — such as providing clear error messages when a form submission fails, using consistent button placement across screens, showing a confirmation dialog before a destructive action, or displaying loading indicators during async operations.</w:t>
+      </w:r>
+    </w:p>
+    <w:p>
+      <w:r>
+        <w:pict>
+          <v:rect style="width:0;height:1.5pt" o:hralign="center" o:hrstd="t" o:hr="t"/>
+        </w:pict>
+      </w:r>
+    </w:p>
+    <w:bookmarkEnd w:id="27"/>
+    <w:bookmarkStart w:id="28" w:name="X5729973c532c6a11acd848cc4ebbec4fc6f87fc"/>
+    <w:p>
+      <w:pPr>
+        <w:pStyle w:val="Heading3"/>
+      </w:pPr>
+      <w:r>
+        <w:t xml:space="preserve">Section 5 — External Interface Requirements</w:t>
+      </w:r>
+    </w:p>
+    <w:p>
+      <w:pPr>
+        <w:pStyle w:val="FirstParagraph"/>
+      </w:pPr>
+      <w:r>
+        <w:t xml:space="preserve">Describe how your system actively integrates with external services and data. If a service is listed as a dependency in Section 2, specify its interface contract here. Include any of the following that apply:</w:t>
       </w:r>
     </w:p>
     <w:p>
@@ -823,20 +898,17 @@
         </w:numPr>
       </w:pPr>
       <w:r>
-        <w:t xml:space="preserve">Write a</w:t>
-      </w:r>
-      <w:r>
-        <w:t xml:space="preserve"> </w:t>
-      </w:r>
-      <w:r>
         <w:rPr>
           <w:b/>
           <w:bCs/>
         </w:rPr>
-        <w:t xml:space="preserve">user scenario</w:t>
-      </w:r>
-      <w:r>
-        <w:t xml:space="preserve">: a step-by-step description of how a user interacts with the feature</w:t>
+        <w:t xml:space="preserve">External APIs and Services:</w:t>
+      </w:r>
+      <w:r>
+        <w:t xml:space="preserve"> </w:t>
+      </w:r>
+      <w:r>
+        <w:t xml:space="preserve">Third-party services your system calls (e.g., Google Maps, Stripe, a public dataset API) — include what data is exchanged and how errors are handled</w:t>
       </w:r>
     </w:p>
     <w:p>
@@ -848,23 +920,17 @@
         </w:numPr>
       </w:pPr>
       <w:r>
-        <w:t xml:space="preserve">Include a</w:t>
-      </w:r>
-      <w:r>
-        <w:t xml:space="preserve"> </w:t>
-      </w:r>
-      <w:r>
         <w:rPr>
           <w:b/>
           <w:bCs/>
         </w:rPr>
-        <w:t xml:space="preserve">storyboard or mockup</w:t>
-      </w:r>
-      <w:r>
-        <w:t xml:space="preserve"> </w:t>
-      </w:r>
-      <w:r>
-        <w:t xml:space="preserve">showing the user flow</w:t>
+        <w:t xml:space="preserve">Data Import/Export:</w:t>
+      </w:r>
+      <w:r>
+        <w:t xml:space="preserve"> </w:t>
+      </w:r>
+      <w:r>
+        <w:t xml:space="preserve">Any files or data formats the system must read or produce (e.g., CSV uploads, PDF exports)</w:t>
       </w:r>
     </w:p>
     <w:p>
@@ -880,13 +946,13 @@
           <w:b/>
           <w:bCs/>
         </w:rPr>
-        <w:t xml:space="preserve">Justification:</w:t>
-      </w:r>
-      <w:r>
-        <w:t xml:space="preserve"> </w:t>
-      </w:r>
-      <w:r>
-        <w:t xml:space="preserve">Explain how your design promotes usability (clarity, feedback, consistency)</w:t>
+        <w:t xml:space="preserve">Hardware Interfaces:</w:t>
+      </w:r>
+      <w:r>
+        <w:t xml:space="preserve"> </w:t>
+      </w:r>
+      <w:r>
+        <w:t xml:space="preserve">Any device-specific requirements (e.g., camera access, GPS)</w:t>
       </w:r>
     </w:p>
     <w:p>
@@ -896,14 +962,14 @@
         </w:pict>
       </w:r>
     </w:p>
-    <w:bookmarkEnd w:id="27"/>
-    <w:bookmarkStart w:id="28" w:name="X5729973c532c6a11acd848cc4ebbec4fc6f87fc"/>
+    <w:bookmarkEnd w:id="28"/>
+    <w:bookmarkStart w:id="29" w:name="section-6--data-and-model-design"/>
     <w:p>
       <w:pPr>
         <w:pStyle w:val="Heading3"/>
       </w:pPr>
       <w:r>
-        <w:t xml:space="preserve">Section 5 — External Interface Requirements</w:t>
+        <w:t xml:space="preserve">Section 6 — Data and Model Design</w:t>
       </w:r>
     </w:p>
     <w:p>
@@ -911,7 +977,23 @@
         <w:pStyle w:val="FirstParagraph"/>
       </w:pPr>
       <w:r>
-        <w:t xml:space="preserve">Describe how your system actively integrates with external services and data. If a service is listed as a dependency in Section 2, specify its interface contract here. Include any of the following that apply:</w:t>
+        <w:t xml:space="preserve">Include a</w:t>
+      </w:r>
+      <w:r>
+        <w:t xml:space="preserve"> </w:t>
+      </w:r>
+      <w:r>
+        <w:rPr>
+          <w:b/>
+          <w:bCs/>
+        </w:rPr>
+        <w:t xml:space="preserve">UML Class Diagram</w:t>
+      </w:r>
+      <w:r>
+        <w:t xml:space="preserve"> </w:t>
+      </w:r>
+      <w:r>
+        <w:t xml:space="preserve">showing:</w:t>
       </w:r>
     </w:p>
     <w:p>
@@ -923,17 +1005,7 @@
         </w:numPr>
       </w:pPr>
       <w:r>
-        <w:rPr>
-          <w:b/>
-          <w:bCs/>
-        </w:rPr>
-        <w:t xml:space="preserve">External APIs and Services:</w:t>
-      </w:r>
-      <w:r>
-        <w:t xml:space="preserve"> </w:t>
-      </w:r>
-      <w:r>
-        <w:t xml:space="preserve">Third-party services your system calls (e.g., Google Maps, Stripe, a public dataset API) — include what data is exchanged and how errors are handled</w:t>
+        <w:t xml:space="preserve">Model classes with attributes (and types)</w:t>
       </w:r>
     </w:p>
     <w:p>
@@ -945,39 +1017,57 @@
         </w:numPr>
       </w:pPr>
       <w:r>
+        <w:t xml:space="preserve">Relationships between classes (with labeled associations and multiplicities)</w:t>
+      </w:r>
+    </w:p>
+    <w:p>
+      <w:pPr>
+        <w:pStyle w:val="FirstParagraph"/>
+      </w:pPr>
+      <w:r>
+        <w:t xml:space="preserve">Use proper UML notation throughout.</w:t>
+      </w:r>
+    </w:p>
+    <w:p>
+      <w:pPr>
+        <w:pStyle w:val="BodyText"/>
+      </w:pPr>
+      <w:r>
+        <w:t xml:space="preserve">For each model class, include a</w:t>
+      </w:r>
+      <w:r>
+        <w:t xml:space="preserve"> </w:t>
+      </w:r>
+      <w:r>
         <w:rPr>
           <w:b/>
           <w:bCs/>
         </w:rPr>
-        <w:t xml:space="preserve">Data Import/Export:</w:t>
-      </w:r>
-      <w:r>
-        <w:t xml:space="preserve"> </w:t>
-      </w:r>
-      <w:r>
-        <w:t xml:space="preserve">Any files or data formats the system must read or produce (e.g., CSV uploads, PDF exports)</w:t>
-      </w:r>
-    </w:p>
-    <w:p>
-      <w:pPr>
-        <w:pStyle w:val="Compact"/>
-        <w:numPr>
-          <w:ilvl w:val="0"/>
-          <w:numId w:val="1006"/>
-        </w:numPr>
+        <w:t xml:space="preserve">validations table</w:t>
+      </w:r>
+      <w:r>
+        <w:t xml:space="preserve"> </w:t>
+      </w:r>
+      <w:r>
+        <w:t xml:space="preserve">listing every attribute and its validation rules (e.g., presence, uniqueness, format, length, numericality). These should reflect the constraints your application will enforce, not just database-level constraints.</w:t>
+      </w:r>
+    </w:p>
+    <w:p>
+      <w:pPr>
+        <w:pStyle w:val="BodyText"/>
       </w:pPr>
       <w:r>
         <w:rPr>
           <w:b/>
           <w:bCs/>
         </w:rPr>
-        <w:t xml:space="preserve">Hardware Interfaces:</w:t>
-      </w:r>
-      <w:r>
-        <w:t xml:space="preserve"> </w:t>
-      </w:r>
-      <w:r>
-        <w:t xml:space="preserve">Any device-specific requirements (e.g., camera access, GPS)</w:t>
+        <w:t xml:space="preserve">Justification:</w:t>
+      </w:r>
+      <w:r>
+        <w:t xml:space="preserve"> </w:t>
+      </w:r>
+      <w:r>
+        <w:t xml:space="preserve">Write 1–2 paragraphs explaining your design choices — why you chose specific relationships (association vs. aggregation vs. composition) and how the model supports your user stories.</w:t>
       </w:r>
     </w:p>
     <w:p>
@@ -987,14 +1077,14 @@
         </w:pict>
       </w:r>
     </w:p>
-    <w:bookmarkEnd w:id="28"/>
-    <w:bookmarkStart w:id="29" w:name="section-6--data-and-model-design"/>
+    <w:bookmarkEnd w:id="29"/>
+    <w:bookmarkStart w:id="31" w:name="section-7--non-functional-requirements"/>
     <w:p>
       <w:pPr>
         <w:pStyle w:val="Heading3"/>
       </w:pPr>
       <w:r>
-        <w:t xml:space="preserve">Section 6 — Data and Model Design</w:t>
+        <w:t xml:space="preserve">Section 7 — Non-Functional Requirements</w:t>
       </w:r>
     </w:p>
     <w:p>
@@ -1002,23 +1092,15 @@
         <w:pStyle w:val="FirstParagraph"/>
       </w:pPr>
       <w:r>
-        <w:t xml:space="preserve">Include a</w:t>
-      </w:r>
-      <w:r>
-        <w:t xml:space="preserve"> </w:t>
-      </w:r>
-      <w:r>
-        <w:rPr>
-          <w:b/>
-          <w:bCs/>
-        </w:rPr>
-        <w:t xml:space="preserve">UML Class Diagram</w:t>
-      </w:r>
-      <w:r>
-        <w:t xml:space="preserve"> </w:t>
-      </w:r>
-      <w:r>
-        <w:t xml:space="preserve">showing:</w:t>
+        <w:t xml:space="preserve">Describe quality goals and constraints that apply across the whole system. At this stage, keep each item brief — this section will be refined in later milestones.</w:t>
+      </w:r>
+    </w:p>
+    <w:p>
+      <w:pPr>
+        <w:pStyle w:val="BodyText"/>
+      </w:pPr>
+      <w:r>
+        <w:t xml:space="preserve">Common categories to consider:</w:t>
       </w:r>
     </w:p>
     <w:p>
@@ -1030,7 +1112,17 @@
         </w:numPr>
       </w:pPr>
       <w:r>
-        <w:t xml:space="preserve">Model classes with attributes (and types)</w:t>
+        <w:rPr>
+          <w:b/>
+          <w:bCs/>
+        </w:rPr>
+        <w:t xml:space="preserve">Performance:</w:t>
+      </w:r>
+      <w:r>
+        <w:t xml:space="preserve"> </w:t>
+      </w:r>
+      <w:r>
+        <w:t xml:space="preserve">Response time targets, expected load</w:t>
       </w:r>
     </w:p>
     <w:p>
@@ -1042,50 +1134,92 @@
         </w:numPr>
       </w:pPr>
       <w:r>
-        <w:t xml:space="preserve">Relationships between classes (with labeled associations and multiplicities)</w:t>
-      </w:r>
-    </w:p>
-    <w:p>
-      <w:pPr>
-        <w:pStyle w:val="FirstParagraph"/>
-      </w:pPr>
-      <w:r>
-        <w:t xml:space="preserve">Use proper UML notation throughout.</w:t>
-      </w:r>
-    </w:p>
-    <w:p>
-      <w:pPr>
-        <w:pStyle w:val="BodyText"/>
-      </w:pPr>
-      <w:r>
         <w:rPr>
           <w:b/>
           <w:bCs/>
         </w:rPr>
-        <w:t xml:space="preserve">Justification:</w:t>
-      </w:r>
-      <w:r>
-        <w:t xml:space="preserve"> </w:t>
-      </w:r>
-      <w:r>
-        <w:t xml:space="preserve">Write 1–2 paragraphs explaining your design choices — why you chose specific relationships (association vs. aggregation vs. composition) and how the model supports your user stories.</w:t>
-      </w:r>
-    </w:p>
-    <w:p>
-      <w:r>
-        <w:pict>
-          <v:rect style="width:0;height:1.5pt" o:hralign="center" o:hrstd="t" o:hr="t"/>
-        </w:pict>
-      </w:r>
-    </w:p>
-    <w:bookmarkEnd w:id="29"/>
-    <w:bookmarkStart w:id="31" w:name="section-7--non-functional-requirements"/>
-    <w:p>
-      <w:pPr>
-        <w:pStyle w:val="Heading3"/>
-      </w:pPr>
-      <w:r>
-        <w:t xml:space="preserve">Section 7 — Non-Functional Requirements</w:t>
+        <w:t xml:space="preserve">Usability:</w:t>
+      </w:r>
+      <w:r>
+        <w:t xml:space="preserve"> </w:t>
+      </w:r>
+      <w:r>
+        <w:t xml:space="preserve">Accessibility standards, target user skill level</w:t>
+      </w:r>
+    </w:p>
+    <w:p>
+      <w:pPr>
+        <w:pStyle w:val="Compact"/>
+        <w:numPr>
+          <w:ilvl w:val="0"/>
+          <w:numId w:val="1007"/>
+        </w:numPr>
+      </w:pPr>
+      <w:r>
+        <w:rPr>
+          <w:b/>
+          <w:bCs/>
+        </w:rPr>
+        <w:t xml:space="preserve">Scalability:</w:t>
+      </w:r>
+      <w:r>
+        <w:t xml:space="preserve"> </w:t>
+      </w:r>
+      <w:r>
+        <w:t xml:space="preserve">How the system should handle growth</w:t>
+      </w:r>
+    </w:p>
+    <w:p>
+      <w:pPr>
+        <w:pStyle w:val="Compact"/>
+        <w:numPr>
+          <w:ilvl w:val="0"/>
+          <w:numId w:val="1007"/>
+        </w:numPr>
+      </w:pPr>
+      <w:r>
+        <w:rPr>
+          <w:b/>
+          <w:bCs/>
+        </w:rPr>
+        <w:t xml:space="preserve">Reliability:</w:t>
+      </w:r>
+      <w:r>
+        <w:t xml:space="preserve"> </w:t>
+      </w:r>
+      <w:r>
+        <w:t xml:space="preserve">Uptime expectations, data integrity</w:t>
+      </w:r>
+    </w:p>
+    <w:p>
+      <w:pPr>
+        <w:pStyle w:val="Compact"/>
+        <w:numPr>
+          <w:ilvl w:val="0"/>
+          <w:numId w:val="1007"/>
+        </w:numPr>
+      </w:pPr>
+      <w:r>
+        <w:rPr>
+          <w:b/>
+          <w:bCs/>
+        </w:rPr>
+        <w:t xml:space="preserve">Maintainability:</w:t>
+      </w:r>
+      <w:r>
+        <w:t xml:space="preserve"> </w:t>
+      </w:r>
+      <w:r>
+        <w:t xml:space="preserve">Coding standards, modularity expectations</w:t>
+      </w:r>
+    </w:p>
+    <w:bookmarkStart w:id="30" w:name="X34cc87a3ea7878d6121cdd41ebf8c1ed5674e78"/>
+    <w:p>
+      <w:pPr>
+        <w:pStyle w:val="Heading4"/>
+      </w:pPr>
+      <w:r>
+        <w:t xml:space="preserve">Section 7.1 — Security Requirements (Authentication and Authorization)</w:t>
       </w:r>
     </w:p>
     <w:p>
@@ -1093,7 +1227,7 @@
         <w:pStyle w:val="FirstParagraph"/>
       </w:pPr>
       <w:r>
-        <w:t xml:space="preserve">Describe quality goals and constraints that apply across the whole system. At this stage, keep each item brief — this section will be refined in later milestones.</w:t>
+        <w:t xml:space="preserve">Security is a cross-cutting concern that affects the whole system — document it here.</w:t>
       </w:r>
     </w:p>
     <w:p>
@@ -1101,7 +1235,7 @@
         <w:pStyle w:val="BodyText"/>
       </w:pPr>
       <w:r>
-        <w:t xml:space="preserve">Common categories to consider:</w:t>
+        <w:t xml:space="preserve">Required elements:</w:t>
       </w:r>
     </w:p>
     <w:p>
@@ -1113,17 +1247,23 @@
         </w:numPr>
       </w:pPr>
       <w:r>
+        <w:t xml:space="preserve">A</w:t>
+      </w:r>
+      <w:r>
+        <w:t xml:space="preserve"> </w:t>
+      </w:r>
+      <w:r>
         <w:rPr>
           <w:b/>
           <w:bCs/>
         </w:rPr>
-        <w:t xml:space="preserve">Performance:</w:t>
-      </w:r>
-      <w:r>
-        <w:t xml:space="preserve"> </w:t>
-      </w:r>
-      <w:r>
-        <w:t xml:space="preserve">Response time targets, expected load</w:t>
+        <w:t xml:space="preserve">role hierarchy and permissions table or diagram</w:t>
+      </w:r>
+      <w:r>
+        <w:t xml:space="preserve"> </w:t>
+      </w:r>
+      <w:r>
+        <w:t xml:space="preserve">(e.g., Admin, Member, Guest — what each can do)</w:t>
       </w:r>
     </w:p>
     <w:p>
@@ -1135,17 +1275,23 @@
         </w:numPr>
       </w:pPr>
       <w:r>
+        <w:t xml:space="preserve">How</w:t>
+      </w:r>
+      <w:r>
+        <w:t xml:space="preserve"> </w:t>
+      </w:r>
+      <w:r>
         <w:rPr>
           <w:b/>
           <w:bCs/>
         </w:rPr>
-        <w:t xml:space="preserve">Usability:</w:t>
-      </w:r>
-      <w:r>
-        <w:t xml:space="preserve"> </w:t>
-      </w:r>
-      <w:r>
-        <w:t xml:space="preserve">Accessibility standards, target user skill level</w:t>
+        <w:t xml:space="preserve">authentication</w:t>
+      </w:r>
+      <w:r>
+        <w:t xml:space="preserve"> </w:t>
+      </w:r>
+      <w:r>
+        <w:t xml:space="preserve">works (e.g., login form, session, token)</w:t>
       </w:r>
     </w:p>
     <w:p>
@@ -1157,86 +1303,59 @@
         </w:numPr>
       </w:pPr>
       <w:r>
+        <w:t xml:space="preserve">Which features require login or a specific role</w:t>
+      </w:r>
+    </w:p>
+    <w:p>
+      <w:pPr>
+        <w:pStyle w:val="FirstParagraph"/>
+      </w:pPr>
+      <w:r>
         <w:rPr>
           <w:b/>
           <w:bCs/>
         </w:rPr>
-        <w:t xml:space="preserve">Scalability:</w:t>
-      </w:r>
-      <w:r>
-        <w:t xml:space="preserve"> </w:t>
-      </w:r>
-      <w:r>
-        <w:t xml:space="preserve">How the system should handle growth</w:t>
-      </w:r>
-    </w:p>
-    <w:p>
-      <w:pPr>
-        <w:pStyle w:val="Compact"/>
-        <w:numPr>
-          <w:ilvl w:val="0"/>
-          <w:numId w:val="1008"/>
-        </w:numPr>
-      </w:pPr>
+        <w:t xml:space="preserve">Justification:</w:t>
+      </w:r>
+      <w:r>
+        <w:t xml:space="preserve"> </w:t>
+      </w:r>
+      <w:r>
+        <w:t xml:space="preserve">Explain how your design follows the</w:t>
+      </w:r>
+      <w:r>
+        <w:t xml:space="preserve"> </w:t>
+      </w:r>
       <w:r>
         <w:rPr>
           <w:b/>
           <w:bCs/>
         </w:rPr>
-        <w:t xml:space="preserve">Reliability:</w:t>
-      </w:r>
-      <w:r>
-        <w:t xml:space="preserve"> </w:t>
-      </w:r>
-      <w:r>
-        <w:t xml:space="preserve">Uptime expectations, data integrity</w:t>
-      </w:r>
-    </w:p>
-    <w:p>
-      <w:pPr>
-        <w:pStyle w:val="Compact"/>
-        <w:numPr>
-          <w:ilvl w:val="0"/>
-          <w:numId w:val="1008"/>
-        </w:numPr>
-      </w:pPr>
-      <w:r>
-        <w:rPr>
-          <w:b/>
-          <w:bCs/>
-        </w:rPr>
-        <w:t xml:space="preserve">Maintainability:</w:t>
-      </w:r>
-      <w:r>
-        <w:t xml:space="preserve"> </w:t>
-      </w:r>
-      <w:r>
-        <w:t xml:space="preserve">Coding standards, modularity expectations</w:t>
-      </w:r>
-    </w:p>
-    <w:bookmarkStart w:id="30" w:name="X34cc87a3ea7878d6121cdd41ebf8c1ed5674e78"/>
-    <w:p>
-      <w:pPr>
-        <w:pStyle w:val="Heading4"/>
-      </w:pPr>
-      <w:r>
-        <w:t xml:space="preserve">Section 7.1 — Security Requirements (Authentication and Authorization)</w:t>
-      </w:r>
-    </w:p>
-    <w:p>
-      <w:pPr>
-        <w:pStyle w:val="FirstParagraph"/>
-      </w:pPr>
-      <w:r>
-        <w:t xml:space="preserve">Security is a cross-cutting concern that affects the whole system — document it here.</w:t>
-      </w:r>
-    </w:p>
-    <w:p>
-      <w:pPr>
-        <w:pStyle w:val="BodyText"/>
-      </w:pPr>
-      <w:r>
-        <w:t xml:space="preserve">Required elements:</w:t>
+        <w:t xml:space="preserve">Least Privilege</w:t>
+      </w:r>
+      <w:r>
+        <w:t xml:space="preserve"> </w:t>
+      </w:r>
+      <w:r>
+        <w:t xml:space="preserve">principle, protects user data, and can accommodate new roles in the future.</w:t>
+      </w:r>
+    </w:p>
+    <w:p>
+      <w:r>
+        <w:pict>
+          <v:rect style="width:0;height:1.5pt" o:hralign="center" o:hrstd="t" o:hr="t"/>
+        </w:pict>
+      </w:r>
+    </w:p>
+    <w:bookmarkEnd w:id="30"/>
+    <w:bookmarkEnd w:id="31"/>
+    <w:bookmarkStart w:id="32" w:name="section-8--glossary-and-references"/>
+    <w:p>
+      <w:pPr>
+        <w:pStyle w:val="Heading3"/>
+      </w:pPr>
+      <w:r>
+        <w:t xml:space="preserve">Section 8 — Glossary and References</w:t>
       </w:r>
     </w:p>
     <w:p>
@@ -1248,23 +1367,7 @@
         </w:numPr>
       </w:pPr>
       <w:r>
-        <w:t xml:space="preserve">A</w:t>
-      </w:r>
-      <w:r>
-        <w:t xml:space="preserve"> </w:t>
-      </w:r>
-      <w:r>
-        <w:rPr>
-          <w:b/>
-          <w:bCs/>
-        </w:rPr>
-        <w:t xml:space="preserve">role hierarchy and permissions table or diagram</w:t>
-      </w:r>
-      <w:r>
-        <w:t xml:space="preserve"> </w:t>
-      </w:r>
-      <w:r>
-        <w:t xml:space="preserve">(e.g., Admin, Member, Guest — what each can do)</w:t>
+        <w:t xml:space="preserve">Define any domain-specific terms and abbreviations</w:t>
       </w:r>
     </w:p>
     <w:p>
@@ -1273,110 +1376,6 @@
         <w:numPr>
           <w:ilvl w:val="0"/>
           <w:numId w:val="1009"/>
-        </w:numPr>
-      </w:pPr>
-      <w:r>
-        <w:t xml:space="preserve">How</w:t>
-      </w:r>
-      <w:r>
-        <w:t xml:space="preserve"> </w:t>
-      </w:r>
-      <w:r>
-        <w:rPr>
-          <w:b/>
-          <w:bCs/>
-        </w:rPr>
-        <w:t xml:space="preserve">authentication</w:t>
-      </w:r>
-      <w:r>
-        <w:t xml:space="preserve"> </w:t>
-      </w:r>
-      <w:r>
-        <w:t xml:space="preserve">works (e.g., login form, session, token)</w:t>
-      </w:r>
-    </w:p>
-    <w:p>
-      <w:pPr>
-        <w:pStyle w:val="Compact"/>
-        <w:numPr>
-          <w:ilvl w:val="0"/>
-          <w:numId w:val="1009"/>
-        </w:numPr>
-      </w:pPr>
-      <w:r>
-        <w:t xml:space="preserve">Which features require login or a specific role</w:t>
-      </w:r>
-    </w:p>
-    <w:p>
-      <w:pPr>
-        <w:pStyle w:val="FirstParagraph"/>
-      </w:pPr>
-      <w:r>
-        <w:rPr>
-          <w:b/>
-          <w:bCs/>
-        </w:rPr>
-        <w:t xml:space="preserve">Justification:</w:t>
-      </w:r>
-      <w:r>
-        <w:t xml:space="preserve"> </w:t>
-      </w:r>
-      <w:r>
-        <w:t xml:space="preserve">Explain how your design follows the</w:t>
-      </w:r>
-      <w:r>
-        <w:t xml:space="preserve"> </w:t>
-      </w:r>
-      <w:r>
-        <w:rPr>
-          <w:b/>
-          <w:bCs/>
-        </w:rPr>
-        <w:t xml:space="preserve">Least Privilege</w:t>
-      </w:r>
-      <w:r>
-        <w:t xml:space="preserve"> </w:t>
-      </w:r>
-      <w:r>
-        <w:t xml:space="preserve">principle, protects user data, and can accommodate new roles in the future.</w:t>
-      </w:r>
-    </w:p>
-    <w:p>
-      <w:r>
-        <w:pict>
-          <v:rect style="width:0;height:1.5pt" o:hralign="center" o:hrstd="t" o:hr="t"/>
-        </w:pict>
-      </w:r>
-    </w:p>
-    <w:bookmarkEnd w:id="30"/>
-    <w:bookmarkEnd w:id="31"/>
-    <w:bookmarkStart w:id="32" w:name="section-8--glossary-and-references"/>
-    <w:p>
-      <w:pPr>
-        <w:pStyle w:val="Heading3"/>
-      </w:pPr>
-      <w:r>
-        <w:t xml:space="preserve">Section 8 — Glossary and References</w:t>
-      </w:r>
-    </w:p>
-    <w:p>
-      <w:pPr>
-        <w:pStyle w:val="Compact"/>
-        <w:numPr>
-          <w:ilvl w:val="0"/>
-          <w:numId w:val="1010"/>
-        </w:numPr>
-      </w:pPr>
-      <w:r>
-        <w:t xml:space="preserve">Define any domain-specific terms and abbreviations</w:t>
-      </w:r>
-    </w:p>
-    <w:p>
-      <w:pPr>
-        <w:pStyle w:val="Compact"/>
-        <w:numPr>
-          <w:ilvl w:val="0"/>
-          <w:numId w:val="1010"/>
         </w:numPr>
       </w:pPr>
       <w:r>
@@ -1528,7 +1527,7 @@
               <w:pStyle w:val="Compact"/>
             </w:pPr>
             <w:r>
-              <w:t xml:space="preserve">Storyboards &amp; Usability Justification</w:t>
+              <w:t xml:space="preserve">Wireflows &amp; Usability Justification</w:t>
             </w:r>
           </w:p>
         </w:tc>
@@ -1550,7 +1549,7 @@
               <w:pStyle w:val="Compact"/>
             </w:pPr>
             <w:r>
-              <w:t xml:space="preserve">Visuals effectively illustrate user flows and are explained clearly</w:t>
+              <w:t xml:space="preserve">Wireflows effectively illustrate happy path user flows and usability choices are explained clearly</w:t>
             </w:r>
           </w:p>
         </w:tc>
@@ -1886,11 +1885,118 @@
         <w:pStyle w:val="Compact"/>
         <w:numPr>
           <w:ilvl w:val="0"/>
-          <w:numId w:val="1011"/>
+          <w:numId w:val="1010"/>
         </w:numPr>
       </w:pPr>
       <w:r>
         <w:t xml:space="preserve">Be honest and specific</w:t>
+      </w:r>
+    </w:p>
+    <w:p>
+      <w:pPr>
+        <w:pStyle w:val="Compact"/>
+        <w:numPr>
+          <w:ilvl w:val="0"/>
+          <w:numId w:val="1010"/>
+        </w:numPr>
+      </w:pPr>
+      <w:r>
+        <w:t xml:space="preserve">Comments are required for any</w:t>
+      </w:r>
+      <w:r>
+        <w:t xml:space="preserve"> </w:t>
+      </w:r>
+      <w:r>
+        <w:rPr>
+          <w:i/>
+          <w:iCs/>
+        </w:rPr>
+        <w:t xml:space="preserve">Terrible</w:t>
+      </w:r>
+      <w:r>
+        <w:t xml:space="preserve">,</w:t>
+      </w:r>
+      <w:r>
+        <w:t xml:space="preserve"> </w:t>
+      </w:r>
+      <w:r>
+        <w:rPr>
+          <w:i/>
+          <w:iCs/>
+        </w:rPr>
+        <w:t xml:space="preserve">Poor</w:t>
+      </w:r>
+      <w:r>
+        <w:t xml:space="preserve">, or</w:t>
+      </w:r>
+      <w:r>
+        <w:t xml:space="preserve"> </w:t>
+      </w:r>
+      <w:r>
+        <w:rPr>
+          <w:i/>
+          <w:iCs/>
+        </w:rPr>
+        <w:t xml:space="preserve">Excellent</w:t>
+      </w:r>
+      <w:r>
+        <w:t xml:space="preserve"> </w:t>
+      </w:r>
+      <w:r>
+        <w:t xml:space="preserve">rating</w:t>
+      </w:r>
+    </w:p>
+    <w:p>
+      <w:pPr>
+        <w:pStyle w:val="Compact"/>
+        <w:numPr>
+          <w:ilvl w:val="0"/>
+          <w:numId w:val="1010"/>
+        </w:numPr>
+      </w:pPr>
+      <w:r>
+        <w:t xml:space="preserve">Reviews are confidential and graded on the quality of your feedback</w:t>
+      </w:r>
+    </w:p>
+    <w:p>
+      <w:pPr>
+        <w:pStyle w:val="FirstParagraph"/>
+      </w:pPr>
+      <w:r>
+        <w:t xml:space="preserve">See the</w:t>
+      </w:r>
+      <w:r>
+        <w:t xml:space="preserve"> </w:t>
+      </w:r>
+      <w:r>
+        <w:rPr>
+          <w:i/>
+          <w:iCs/>
+        </w:rPr>
+        <w:t xml:space="preserve">Teammate Reviews</w:t>
+      </w:r>
+      <w:r>
+        <w:t xml:space="preserve"> </w:t>
+      </w:r>
+      <w:r>
+        <w:t xml:space="preserve">document for instructions.</w:t>
+      </w:r>
+    </w:p>
+    <w:p>
+      <w:r>
+        <w:pict>
+          <v:rect style="width:0;height:1.5pt" o:hralign="center" o:hrstd="t" o:hr="t"/>
+        </w:pict>
+      </w:r>
+    </w:p>
+    <w:bookmarkEnd w:id="36"/>
+    <w:bookmarkStart w:id="37" w:name="tips-for-success"/>
+    <w:p>
+      <w:pPr>
+        <w:pStyle w:val="Heading2"/>
+      </w:pPr>
+      <w:r>
+        <w:t xml:space="preserve">Tips for Success</w:t>
       </w:r>
     </w:p>
     <w:p>
@@ -1902,49 +2008,17 @@
         </w:numPr>
       </w:pPr>
       <w:r>
-        <w:t xml:space="preserve">Comments are required for any</w:t>
-      </w:r>
-      <w:r>
-        <w:t xml:space="preserve"> </w:t>
-      </w:r>
-      <w:r>
-        <w:rPr>
-          <w:i/>
-          <w:iCs/>
-        </w:rPr>
-        <w:t xml:space="preserve">Terrible</w:t>
-      </w:r>
-      <w:r>
-        <w:t xml:space="preserve">,</w:t>
-      </w:r>
-      <w:r>
-        <w:t xml:space="preserve"> </w:t>
-      </w:r>
-      <w:r>
-        <w:rPr>
-          <w:i/>
-          <w:iCs/>
-        </w:rPr>
-        <w:t xml:space="preserve">Poor</w:t>
-      </w:r>
-      <w:r>
-        <w:t xml:space="preserve">, or</w:t>
-      </w:r>
-      <w:r>
-        <w:t xml:space="preserve"> </w:t>
-      </w:r>
-      <w:r>
-        <w:rPr>
-          <w:i/>
-          <w:iCs/>
-        </w:rPr>
-        <w:t xml:space="preserve">Excellent</w:t>
-      </w:r>
-      <w:r>
-        <w:t xml:space="preserve"> </w:t>
-      </w:r>
-      <w:r>
-        <w:t xml:space="preserve">rating</w:t>
+        <w:rPr>
+          <w:b/>
+          <w:bCs/>
+        </w:rPr>
+        <w:t xml:space="preserve">Traceability matters:</w:t>
+      </w:r>
+      <w:r>
+        <w:t xml:space="preserve"> </w:t>
+      </w:r>
+      <w:r>
+        <w:t xml:space="preserve">each user story should link to a scenario; each scenario should reference relevant classes and roles</w:t>
       </w:r>
     </w:p>
     <w:p>
@@ -1956,31 +2030,31 @@
         </w:numPr>
       </w:pPr>
       <w:r>
-        <w:t xml:space="preserve">Reviews are confidential and graded on the quality of your feedback</w:t>
-      </w:r>
-    </w:p>
-    <w:p>
-      <w:pPr>
-        <w:pStyle w:val="FirstParagraph"/>
-      </w:pPr>
-      <w:r>
-        <w:t xml:space="preserve">See the</w:t>
-      </w:r>
-      <w:r>
-        <w:t xml:space="preserve"> </w:t>
-      </w:r>
-      <w:r>
-        <w:rPr>
-          <w:i/>
-          <w:iCs/>
-        </w:rPr>
-        <w:t xml:space="preserve">Teammate Reviews</w:t>
-      </w:r>
-      <w:r>
-        <w:t xml:space="preserve"> </w:t>
-      </w:r>
-      <w:r>
-        <w:t xml:space="preserve">document for instructions.</w:t>
+        <w:t xml:space="preserve">Write the SRS as if you were handing it to a new developer or proposing it to a client</w:t>
+      </w:r>
+    </w:p>
+    <w:p>
+      <w:pPr>
+        <w:pStyle w:val="Compact"/>
+        <w:numPr>
+          <w:ilvl w:val="0"/>
+          <w:numId w:val="1011"/>
+        </w:numPr>
+      </w:pPr>
+      <w:r>
+        <w:t xml:space="preserve">You'll revisit and refine this document in M1 and M2 — don't wait for it to be perfect</w:t>
+      </w:r>
+    </w:p>
+    <w:p>
+      <w:pPr>
+        <w:pStyle w:val="Compact"/>
+        <w:numPr>
+          <w:ilvl w:val="0"/>
+          <w:numId w:val="1011"/>
+        </w:numPr>
+      </w:pPr>
+      <w:r>
+        <w:t xml:space="preserve">Update the version history table each time you revise the document</w:t>
       </w:r>
     </w:p>
     <w:p>
@@ -1990,81 +2064,6 @@
         </w:pict>
       </w:r>
     </w:p>
-    <w:bookmarkEnd w:id="36"/>
-    <w:bookmarkStart w:id="37" w:name="tips-for-success"/>
-    <w:p>
-      <w:pPr>
-        <w:pStyle w:val="Heading2"/>
-      </w:pPr>
-      <w:r>
-        <w:t xml:space="preserve">Tips for Success</w:t>
-      </w:r>
-    </w:p>
-    <w:p>
-      <w:pPr>
-        <w:pStyle w:val="Compact"/>
-        <w:numPr>
-          <w:ilvl w:val="0"/>
-          <w:numId w:val="1012"/>
-        </w:numPr>
-      </w:pPr>
-      <w:r>
-        <w:rPr>
-          <w:b/>
-          <w:bCs/>
-        </w:rPr>
-        <w:t xml:space="preserve">Traceability matters:</w:t>
-      </w:r>
-      <w:r>
-        <w:t xml:space="preserve"> </w:t>
-      </w:r>
-      <w:r>
-        <w:t xml:space="preserve">each user story should link to a scenario; each scenario should reference relevant classes and roles</w:t>
-      </w:r>
-    </w:p>
-    <w:p>
-      <w:pPr>
-        <w:pStyle w:val="Compact"/>
-        <w:numPr>
-          <w:ilvl w:val="0"/>
-          <w:numId w:val="1012"/>
-        </w:numPr>
-      </w:pPr>
-      <w:r>
-        <w:t xml:space="preserve">Write the SRS as if you were handing it to a new developer or proposing it to a client</w:t>
-      </w:r>
-    </w:p>
-    <w:p>
-      <w:pPr>
-        <w:pStyle w:val="Compact"/>
-        <w:numPr>
-          <w:ilvl w:val="0"/>
-          <w:numId w:val="1012"/>
-        </w:numPr>
-      </w:pPr>
-      <w:r>
-        <w:t xml:space="preserve">You'll revisit and refine this document in M1 and M2 — don't wait for it to be perfect</w:t>
-      </w:r>
-    </w:p>
-    <w:p>
-      <w:pPr>
-        <w:pStyle w:val="Compact"/>
-        <w:numPr>
-          <w:ilvl w:val="0"/>
-          <w:numId w:val="1012"/>
-        </w:numPr>
-      </w:pPr>
-      <w:r>
-        <w:t xml:space="preserve">Update the version history table each time you revise the document</w:t>
-      </w:r>
-    </w:p>
-    <w:p>
-      <w:r>
-        <w:pict>
-          <v:rect style="width:0;height:1.5pt" o:hralign="center" o:hrstd="t" o:hr="t"/>
-        </w:pict>
-      </w:r>
-    </w:p>
     <w:bookmarkEnd w:id="37"/>
     <w:bookmarkStart w:id="38" w:name="appendix-a--suggested-srs-outline"/>
     <w:p>
@@ -2137,7 +2136,7 @@
         <w:rPr>
           <w:rStyle w:val="VerbatimChar"/>
         </w:rPr>
-        <w:t xml:space="preserve">4. User Scenarios and Storyboards</w:t>
+        <w:t xml:space="preserve">4. User Scenarios and Wireflows</w:t>
       </w:r>
       <w:r>
         <w:br/>
@@ -2511,9 +2510,6 @@
     <w:abstractNumId w:val="991"/>
   </w:num>
   <w:num w:numId="1011">
-    <w:abstractNumId w:val="991"/>
-  </w:num>
-  <w:num w:numId="1012">
     <w:abstractNumId w:val="991"/>
   </w:num>
 </w:numbering>

</xml_diff>